<commit_message>
fix fig1 and use most recent model outputs
</commit_message>
<xml_diff>
--- a/images/tables.docx
+++ b/images/tables.docx
@@ -3153,22 +3153,22 @@
             </w:pPr>
             <w:r>
               <w:rPr/>
-              <w:t>ppt_tm1_summer + tavg_tm1_summer</w:t>
-            </w:r>
-          </w:p>
-        </w:tc>
-        <w:tc>
-          <w:tcPr>
-            <w:tcMar/>
-            <w:vAlign w:val="top"/>
-          </w:tcPr>
-          <w:p>
-            <w:pPr>
-              <w:jc w:val="center"/>
-            </w:pPr>
-            <w:r>
-              <w:rPr/>
-              <w:t>21732.9 (1)</w:t>
+              <w:t>ppt_summer_lag1 + tavg_summer_lag1</w:t>
+            </w:r>
+          </w:p>
+        </w:tc>
+        <w:tc>
+          <w:tcPr>
+            <w:tcMar/>
+            <w:vAlign w:val="top"/>
+          </w:tcPr>
+          <w:p>
+            <w:pPr>
+              <w:jc w:val="center"/>
+            </w:pPr>
+            <w:r>
+              <w:rPr/>
+              <w:t>21729.7 (1)</w:t>
             </w:r>
           </w:p>
         </w:tc>
@@ -3198,55 +3198,55 @@
             </w:pPr>
             <w:r>
               <w:rPr/>
-              <w:t>21164.4 (1)</w:t>
-            </w:r>
-          </w:p>
-        </w:tc>
-        <w:tc>
-          <w:tcPr>
-            <w:tcMar/>
-            <w:vAlign w:val="top"/>
-          </w:tcPr>
-          <w:p>
-            <w:pPr>
-              <w:jc w:val="center"/>
-            </w:pPr>
-            <w:r>
-              <w:rPr/>
-              <w:t>0.24 (0.16 - 0.32) + -0.22 (-0.32 - -0.13)</w:t>
-            </w:r>
-          </w:p>
-        </w:tc>
-      </w:tr>
-      <w:tr>
-        <w:trPr/>
-        <w:tc>
-          <w:tcPr>
-            <w:tcMar/>
-            <w:vAlign w:val="top"/>
-          </w:tcPr>
-          <w:p>
-            <w:pPr>
-              <w:jc w:val="center"/>
-            </w:pPr>
-            <w:r>
-              <w:rPr/>
-              <w:t>tavg_tm1_summer + soil_tm1_autumn</w:t>
-            </w:r>
-          </w:p>
-        </w:tc>
-        <w:tc>
-          <w:tcPr>
-            <w:tcMar/>
-            <w:vAlign w:val="top"/>
-          </w:tcPr>
-          <w:p>
-            <w:pPr>
-              <w:jc w:val="center"/>
-            </w:pPr>
-            <w:r>
-              <w:rPr/>
-              <w:t>21746.2 (2)</w:t>
+              <w:t>21165.6 (1)</w:t>
+            </w:r>
+          </w:p>
+        </w:tc>
+        <w:tc>
+          <w:tcPr>
+            <w:tcMar/>
+            <w:vAlign w:val="top"/>
+          </w:tcPr>
+          <w:p>
+            <w:pPr>
+              <w:jc w:val="center"/>
+            </w:pPr>
+            <w:r>
+              <w:rPr/>
+              <w:t>0.24 (0.16 - 0.32) + -0.23 (-0.32 - -0.13)</w:t>
+            </w:r>
+          </w:p>
+        </w:tc>
+      </w:tr>
+      <w:tr>
+        <w:trPr/>
+        <w:tc>
+          <w:tcPr>
+            <w:tcMar/>
+            <w:vAlign w:val="top"/>
+          </w:tcPr>
+          <w:p>
+            <w:pPr>
+              <w:jc w:val="center"/>
+            </w:pPr>
+            <w:r>
+              <w:rPr/>
+              <w:t>tavg_summer_lag1 + soil_autumn_lag1</w:t>
+            </w:r>
+          </w:p>
+        </w:tc>
+        <w:tc>
+          <w:tcPr>
+            <w:tcMar/>
+            <w:vAlign w:val="top"/>
+          </w:tcPr>
+          <w:p>
+            <w:pPr>
+              <w:jc w:val="center"/>
+            </w:pPr>
+            <w:r>
+              <w:rPr/>
+              <w:t>21744.7 (2)</w:t>
             </w:r>
           </w:p>
         </w:tc>
@@ -3276,7 +3276,7 @@
             </w:pPr>
             <w:r>
               <w:rPr/>
-              <w:t>21176.7 (2)</w:t>
+              <w:t>21182.3 (2)</w:t>
             </w:r>
           </w:p>
         </w:tc>
@@ -3309,22 +3309,22 @@
             </w:pPr>
             <w:r>
               <w:rPr/>
-              <w:t>tavg_tm1_summer + soil_tm1_summer</w:t>
-            </w:r>
-          </w:p>
-        </w:tc>
-        <w:tc>
-          <w:tcPr>
-            <w:tcMar/>
-            <w:vAlign w:val="top"/>
-          </w:tcPr>
-          <w:p>
-            <w:pPr>
-              <w:jc w:val="center"/>
-            </w:pPr>
-            <w:r>
-              <w:rPr/>
-              <w:t>21753.4 (3)</w:t>
+              <w:t>tavg_summer_lag1 + soil_summer_lag1</w:t>
+            </w:r>
+          </w:p>
+        </w:tc>
+        <w:tc>
+          <w:tcPr>
+            <w:tcMar/>
+            <w:vAlign w:val="top"/>
+          </w:tcPr>
+          <w:p>
+            <w:pPr>
+              <w:jc w:val="center"/>
+            </w:pPr>
+            <w:r>
+              <w:rPr/>
+              <w:t>21752.9 (3)</w:t>
             </w:r>
           </w:p>
         </w:tc>
@@ -3354,7 +3354,7 @@
             </w:pPr>
             <w:r>
               <w:rPr/>
-              <w:t>21188.9 (3)</w:t>
+              <w:t>21188.5 (3)</w:t>
             </w:r>
           </w:p>
         </w:tc>
@@ -3387,7 +3387,7 @@
             </w:pPr>
             <w:r>
               <w:rPr/>
-              <w:t>tavg_tm1_summer + def_tm1_spring</w:t>
+              <w:t>tavg_summer_lag1 + def_spring_lag1</w:t>
             </w:r>
           </w:p>
         </w:tc>
@@ -3432,7 +3432,7 @@
             </w:pPr>
             <w:r>
               <w:rPr/>
-              <w:t>21190.1 (4)</w:t>
+              <w:t>21190.4 (4)</w:t>
             </w:r>
           </w:p>
         </w:tc>
@@ -3465,22 +3465,22 @@
             </w:pPr>
             <w:r>
               <w:rPr/>
-              <w:t>ppt_tm1_summer + def_tm1_spring</w:t>
-            </w:r>
-          </w:p>
-        </w:tc>
-        <w:tc>
-          <w:tcPr>
-            <w:tcMar/>
-            <w:vAlign w:val="top"/>
-          </w:tcPr>
-          <w:p>
-            <w:pPr>
-              <w:jc w:val="center"/>
-            </w:pPr>
-            <w:r>
-              <w:rPr/>
-              <w:t>21760.1 (5)</w:t>
+              <w:t>ppt_summer_lag1 + def_spring_lag1</w:t>
+            </w:r>
+          </w:p>
+        </w:tc>
+        <w:tc>
+          <w:tcPr>
+            <w:tcMar/>
+            <w:vAlign w:val="top"/>
+          </w:tcPr>
+          <w:p>
+            <w:pPr>
+              <w:jc w:val="center"/>
+            </w:pPr>
+            <w:r>
+              <w:rPr/>
+              <w:t>21760.4 (5)</w:t>
             </w:r>
           </w:p>
         </w:tc>
@@ -3510,7 +3510,7 @@
             </w:pPr>
             <w:r>
               <w:rPr/>
-              <w:t>21193.8 (5)</w:t>
+              <w:t>21194.2 (5)</w:t>
             </w:r>
           </w:p>
         </w:tc>
@@ -3543,22 +3543,22 @@
             </w:pPr>
             <w:r>
               <w:rPr/>
-              <w:t>ppt_tm1_summer + soil_tm1_autumn</w:t>
-            </w:r>
-          </w:p>
-        </w:tc>
-        <w:tc>
-          <w:tcPr>
-            <w:tcMar/>
-            <w:vAlign w:val="top"/>
-          </w:tcPr>
-          <w:p>
-            <w:pPr>
-              <w:jc w:val="center"/>
-            </w:pPr>
-            <w:r>
-              <w:rPr/>
-              <w:t>21764.5 (6)</w:t>
+              <w:t>ppt_summer_lag1 + soil_autumn_lag1</w:t>
+            </w:r>
+          </w:p>
+        </w:tc>
+        <w:tc>
+          <w:tcPr>
+            <w:tcMar/>
+            <w:vAlign w:val="top"/>
+          </w:tcPr>
+          <w:p>
+            <w:pPr>
+              <w:jc w:val="center"/>
+            </w:pPr>
+            <w:r>
+              <w:rPr/>
+              <w:t>21764.4 (6)</w:t>
             </w:r>
           </w:p>
         </w:tc>
@@ -3621,7 +3621,7 @@
             </w:pPr>
             <w:r>
               <w:rPr/>
-              <w:t>ppt_tm1_summer + soil_tm1_summer</w:t>
+              <w:t>ppt_summer_lag1 + soil_summer_lag1</w:t>
             </w:r>
           </w:p>
         </w:tc>
@@ -3699,52 +3699,52 @@
             </w:pPr>
             <w:r>
               <w:rPr/>
-              <w:t>soil_tm1_summer + soil_tm1_autumn</w:t>
-            </w:r>
-          </w:p>
-        </w:tc>
-        <w:tc>
-          <w:tcPr>
-            <w:tcMar/>
-            <w:vAlign w:val="top"/>
-          </w:tcPr>
-          <w:p>
-            <w:pPr>
-              <w:jc w:val="center"/>
-            </w:pPr>
-            <w:r>
-              <w:rPr/>
-              <w:t>21803.2 (8)</w:t>
-            </w:r>
-          </w:p>
-        </w:tc>
-        <w:tc>
-          <w:tcPr>
-            <w:tcMar/>
-            <w:vAlign w:val="top"/>
-          </w:tcPr>
-          <w:p>
-            <w:pPr>
-              <w:jc w:val="center"/>
-            </w:pPr>
-            <w:r>
-              <w:rPr/>
-              <w:t>-11447.4 (8)</w:t>
-            </w:r>
-          </w:p>
-        </w:tc>
-        <w:tc>
-          <w:tcPr>
-            <w:tcMar/>
-            <w:vAlign w:val="top"/>
-          </w:tcPr>
-          <w:p>
-            <w:pPr>
-              <w:jc w:val="center"/>
-            </w:pPr>
-            <w:r>
-              <w:rPr/>
-              <w:t>21235.8 (8)</w:t>
+              <w:t>soil_summer_lag1 + soil_autumn_lag1</w:t>
+            </w:r>
+          </w:p>
+        </w:tc>
+        <w:tc>
+          <w:tcPr>
+            <w:tcMar/>
+            <w:vAlign w:val="top"/>
+          </w:tcPr>
+          <w:p>
+            <w:pPr>
+              <w:jc w:val="center"/>
+            </w:pPr>
+            <w:r>
+              <w:rPr/>
+              <w:t>21803.1 (8)</w:t>
+            </w:r>
+          </w:p>
+        </w:tc>
+        <w:tc>
+          <w:tcPr>
+            <w:tcMar/>
+            <w:vAlign w:val="top"/>
+          </w:tcPr>
+          <w:p>
+            <w:pPr>
+              <w:jc w:val="center"/>
+            </w:pPr>
+            <w:r>
+              <w:rPr/>
+              <w:t>-11447.6 (8)</w:t>
+            </w:r>
+          </w:p>
+        </w:tc>
+        <w:tc>
+          <w:tcPr>
+            <w:tcMar/>
+            <w:vAlign w:val="top"/>
+          </w:tcPr>
+          <w:p>
+            <w:pPr>
+              <w:jc w:val="center"/>
+            </w:pPr>
+            <w:r>
+              <w:rPr/>
+              <w:t>21240.4 (8)</w:t>
             </w:r>
           </w:p>
         </w:tc>
@@ -3777,22 +3777,22 @@
             </w:pPr>
             <w:r>
               <w:rPr/>
-              <w:t>soil_tm1_autumn + def_tm1_spring</w:t>
-            </w:r>
-          </w:p>
-        </w:tc>
-        <w:tc>
-          <w:tcPr>
-            <w:tcMar/>
-            <w:vAlign w:val="top"/>
-          </w:tcPr>
-          <w:p>
-            <w:pPr>
-              <w:jc w:val="center"/>
-            </w:pPr>
-            <w:r>
-              <w:rPr/>
-              <w:t>21806.9 (9)</w:t>
+              <w:t>soil_autumn_lag1 + def_spring_lag1</w:t>
+            </w:r>
+          </w:p>
+        </w:tc>
+        <w:tc>
+          <w:tcPr>
+            <w:tcMar/>
+            <w:vAlign w:val="top"/>
+          </w:tcPr>
+          <w:p>
+            <w:pPr>
+              <w:jc w:val="center"/>
+            </w:pPr>
+            <w:r>
+              <w:rPr/>
+              <w:t>21807.1 (9)</w:t>
             </w:r>
           </w:p>
         </w:tc>
@@ -3822,7 +3822,7 @@
             </w:pPr>
             <w:r>
               <w:rPr/>
-              <w:t>21240.4 (9)</w:t>
+              <w:t>21240.5 (9)</w:t>
             </w:r>
           </w:p>
         </w:tc>
@@ -3855,7 +3855,7 @@
             </w:pPr>
             <w:r>
               <w:rPr/>
-              <w:t>soil_tm1_summer + def_tm1_spring</w:t>
+              <w:t>soil_summer_lag1 + def_spring_lag1</w:t>
             </w:r>
           </w:p>
         </w:tc>

</xml_diff>